<commit_message>
fix: report and slide
</commit_message>
<xml_diff>
--- a/docs/EOS_Idempotent_Payments_Report.docx
+++ b/docs/EOS_Idempotent_Payments_Report.docx
@@ -1117,7 +1117,13 @@
         <w:spacing w:after="100" w:line="259" w:lineRule="auto"/>
       </w:pPr>
       <w:r>
-        <w:t>Project không dùng dataset bên ngoài vì cần kiểm soát duplicate rate và event-time disorder. Dữ liệu được sinh tổng hợp: 5 account seed ban đầu và stream benchmark mặc định 160 events, duplicate rate 30%, window 10 giây, seed 117. Các bảng chính gồm account, payment_request, payment_transaction, global_deduplication_record, wal_log_entry, benchmark_run, stream_window, processor_checkpoint và processing_node.</w:t>
+        <w:t xml:space="preserve">Project không dùng dataset bên ngoài vì cần kiểm soát duplicate rate và event-time disorder. Dữ liệu được sinh tổng hợp: </w:t>
+      </w:r>
+      <w:r>
+        <w:t>100</w:t>
+      </w:r>
+      <w:r>
+        <w:t xml:space="preserve"> account seed ban đầu và stream benchmark mặc định 160 events, duplicate rate 30%, window 10 giây, seed 117. Các bảng chính gồm account, payment_request, payment_transaction, global_deduplication_record, wal_log_entry, benchmark_run, stream_window, processor_checkpoint và processing_node.</w:t>
       </w:r>
     </w:p>
     <w:tbl>
@@ -2389,7 +2395,7 @@
       <w:tr>
         <w:tc>
           <w:tcPr>
-            <w:tcW w:type="dxa" w:w="3360"/>
+            <w:tcW w:w="3360" w:type="dxa"/>
           </w:tcPr>
           <w:p>
             <w:r>
@@ -2399,7 +2405,7 @@
         </w:tc>
         <w:tc>
           <w:tcPr>
-            <w:tcW w:type="dxa" w:w="3360"/>
+            <w:tcW w:w="3360" w:type="dxa"/>
           </w:tcPr>
           <w:p>
             <w:r>
@@ -2409,7 +2415,7 @@
         </w:tc>
         <w:tc>
           <w:tcPr>
-            <w:tcW w:type="dxa" w:w="3360"/>
+            <w:tcW w:w="3360" w:type="dxa"/>
           </w:tcPr>
           <w:p>
             <w:r>
@@ -2421,7 +2427,7 @@
       <w:tr>
         <w:tc>
           <w:tcPr>
-            <w:tcW w:type="dxa" w:w="3360"/>
+            <w:tcW w:w="3360" w:type="dxa"/>
           </w:tcPr>
           <w:p>
             <w:r>
@@ -2431,7 +2437,7 @@
         </w:tc>
         <w:tc>
           <w:tcPr>
-            <w:tcW w:type="dxa" w:w="3360"/>
+            <w:tcW w:w="3360" w:type="dxa"/>
           </w:tcPr>
           <w:p>
             <w:r>
@@ -2441,7 +2447,7 @@
         </w:tc>
         <w:tc>
           <w:tcPr>
-            <w:tcW w:type="dxa" w:w="3360"/>
+            <w:tcW w:w="3360" w:type="dxa"/>
           </w:tcPr>
           <w:p>
             <w:r>
@@ -2453,7 +2459,7 @@
       <w:tr>
         <w:tc>
           <w:tcPr>
-            <w:tcW w:type="dxa" w:w="3360"/>
+            <w:tcW w:w="3360" w:type="dxa"/>
           </w:tcPr>
           <w:p>
             <w:r>
@@ -2463,7 +2469,7 @@
         </w:tc>
         <w:tc>
           <w:tcPr>
-            <w:tcW w:type="dxa" w:w="3360"/>
+            <w:tcW w:w="3360" w:type="dxa"/>
           </w:tcPr>
           <w:p>
             <w:r>
@@ -2473,7 +2479,7 @@
         </w:tc>
         <w:tc>
           <w:tcPr>
-            <w:tcW w:type="dxa" w:w="3360"/>
+            <w:tcW w:w="3360" w:type="dxa"/>
           </w:tcPr>
           <w:p>
             <w:r>
@@ -2911,6 +2917,7 @@
               <w:rPr>
                 <w:sz w:val="18"/>
               </w:rPr>
+              <w:lastRenderedPageBreak/>
               <w:t>walEntries, walCommitted</w:t>
             </w:r>
           </w:p>
@@ -2951,7 +2958,7 @@
       <w:tr>
         <w:tc>
           <w:tcPr>
-            <w:tcW w:type="dxa" w:w="3360"/>
+            <w:tcW w:w="3360" w:type="dxa"/>
           </w:tcPr>
           <w:p>
             <w:r>
@@ -2961,7 +2968,7 @@
         </w:tc>
         <w:tc>
           <w:tcPr>
-            <w:tcW w:type="dxa" w:w="3360"/>
+            <w:tcW w:w="3360" w:type="dxa"/>
           </w:tcPr>
           <w:p>
             <w:r>
@@ -2971,7 +2978,7 @@
         </w:tc>
         <w:tc>
           <w:tcPr>
-            <w:tcW w:type="dxa" w:w="3360"/>
+            <w:tcW w:w="3360" w:type="dxa"/>
           </w:tcPr>
           <w:p>
             <w:r>
@@ -3016,7 +3023,6 @@
         <w:rPr>
           <w:noProof/>
         </w:rPr>
-        <w:lastRenderedPageBreak/>
         <w:drawing>
           <wp:inline distT="0" distB="0" distL="0" distR="0" wp14:anchorId="35BFF58B" wp14:editId="203BA393">
             <wp:extent cx="5760720" cy="5800725"/>
@@ -3080,6 +3086,7 @@
           <w:color w:val="auto"/>
           <w:sz w:val="24"/>
         </w:rPr>
+        <w:lastRenderedPageBreak/>
         <w:t>6.1 Automated Tests</w:t>
       </w:r>
     </w:p>
@@ -3389,13 +3396,6 @@
           <w:sz w:val="18"/>
         </w:rPr>
         <w:br/>
-      </w:r>
-      <w:r>
-        <w:rPr>
-          <w:rFonts w:ascii="Courier New" w:hAnsi="Courier New"/>
-          <w:sz w:val="18"/>
-        </w:rPr>
-        <w:lastRenderedPageBreak/>
         <w:t xml:space="preserve">  + global_dedup_lookup_or_claim</w:t>
       </w:r>
       <w:r>
@@ -3457,8 +3457,8 @@
     <w:tbl>
       <w:tblPr>
         <w:tblStyle w:val="TableGrid"/>
-        <w:tblW w:type="auto" w:w="0"/>
-        <w:tblLook w:firstColumn="1" w:firstRow="1" w:lastColumn="0" w:lastRow="0" w:noHBand="0" w:noVBand="1" w:val="04A0"/>
+        <w:tblW w:w="0" w:type="auto"/>
+        <w:tblLook w:val="04A0" w:firstRow="1" w:lastRow="0" w:firstColumn="1" w:lastColumn="0" w:noHBand="0" w:noVBand="1"/>
       </w:tblPr>
       <w:tblGrid>
         <w:gridCol w:w="2520"/>
@@ -3469,7 +3469,7 @@
       <w:tr>
         <w:tc>
           <w:tcPr>
-            <w:tcW w:type="dxa" w:w="2520"/>
+            <w:tcW w:w="2520" w:type="dxa"/>
           </w:tcPr>
           <w:p>
             <w:r>
@@ -3479,7 +3479,7 @@
         </w:tc>
         <w:tc>
           <w:tcPr>
-            <w:tcW w:type="dxa" w:w="2520"/>
+            <w:tcW w:w="2520" w:type="dxa"/>
           </w:tcPr>
           <w:p>
             <w:r>
@@ -3489,7 +3489,7 @@
         </w:tc>
         <w:tc>
           <w:tcPr>
-            <w:tcW w:type="dxa" w:w="2520"/>
+            <w:tcW w:w="2520" w:type="dxa"/>
           </w:tcPr>
           <w:p>
             <w:r>
@@ -3499,7 +3499,7 @@
         </w:tc>
         <w:tc>
           <w:tcPr>
-            <w:tcW w:type="dxa" w:w="2520"/>
+            <w:tcW w:w="2520" w:type="dxa"/>
           </w:tcPr>
           <w:p>
             <w:r>
@@ -3511,7 +3511,7 @@
       <w:tr>
         <w:tc>
           <w:tcPr>
-            <w:tcW w:type="dxa" w:w="2520"/>
+            <w:tcW w:w="2520" w:type="dxa"/>
           </w:tcPr>
           <w:p>
             <w:r>
@@ -3521,7 +3521,7 @@
         </w:tc>
         <w:tc>
           <w:tcPr>
-            <w:tcW w:type="dxa" w:w="2520"/>
+            <w:tcW w:w="2520" w:type="dxa"/>
           </w:tcPr>
           <w:p>
             <w:r>
@@ -3531,7 +3531,7 @@
         </w:tc>
         <w:tc>
           <w:tcPr>
-            <w:tcW w:type="dxa" w:w="2520"/>
+            <w:tcW w:w="2520" w:type="dxa"/>
           </w:tcPr>
           <w:p>
             <w:r>
@@ -3541,11 +3541,15 @@
         </w:tc>
         <w:tc>
           <w:tcPr>
-            <w:tcW w:type="dxa" w:w="2520"/>
-          </w:tcPr>
-          <w:p>
-            <w:r>
-              <w:t>ALO nhanh hơn vì không dedup/WAL; EOS đổi overhead lấy correctness</w:t>
+            <w:tcW w:w="2520" w:type="dxa"/>
+          </w:tcPr>
+          <w:p>
+            <w:r>
+              <w:t xml:space="preserve">ALO nhanh hơn vì không </w:t>
+            </w:r>
+            <w:r>
+              <w:lastRenderedPageBreak/>
+              <w:t>dedup/WAL; EOS đổi overhead lấy correctness</w:t>
             </w:r>
           </w:p>
         </w:tc>
@@ -3553,17 +3557,18 @@
       <w:tr>
         <w:tc>
           <w:tcPr>
-            <w:tcW w:type="dxa" w:w="2520"/>
-          </w:tcPr>
-          <w:p>
-            <w:r>
+            <w:tcW w:w="2520" w:type="dxa"/>
+          </w:tcPr>
+          <w:p>
+            <w:r>
+              <w:lastRenderedPageBreak/>
               <w:t>Latency avg / p50 / p95 / p99</w:t>
             </w:r>
           </w:p>
         </w:tc>
         <w:tc>
           <w:tcPr>
-            <w:tcW w:type="dxa" w:w="2520"/>
+            <w:tcW w:w="2520" w:type="dxa"/>
           </w:tcPr>
           <w:p>
             <w:r>
@@ -3573,7 +3578,7 @@
         </w:tc>
         <w:tc>
           <w:tcPr>
-            <w:tcW w:type="dxa" w:w="2520"/>
+            <w:tcW w:w="2520" w:type="dxa"/>
           </w:tcPr>
           <w:p>
             <w:r>
@@ -3583,7 +3588,7 @@
         </w:tc>
         <w:tc>
           <w:tcPr>
-            <w:tcW w:type="dxa" w:w="2520"/>
+            <w:tcW w:w="2520" w:type="dxa"/>
           </w:tcPr>
           <w:p>
             <w:r>
@@ -3595,7 +3600,7 @@
       <w:tr>
         <w:tc>
           <w:tcPr>
-            <w:tcW w:type="dxa" w:w="2520"/>
+            <w:tcW w:w="2520" w:type="dxa"/>
           </w:tcPr>
           <w:p>
             <w:r>
@@ -3605,7 +3610,7 @@
         </w:tc>
         <w:tc>
           <w:tcPr>
-            <w:tcW w:type="dxa" w:w="2520"/>
+            <w:tcW w:w="2520" w:type="dxa"/>
           </w:tcPr>
           <w:p>
             <w:r>
@@ -3615,7 +3620,7 @@
         </w:tc>
         <w:tc>
           <w:tcPr>
-            <w:tcW w:type="dxa" w:w="2520"/>
+            <w:tcW w:w="2520" w:type="dxa"/>
           </w:tcPr>
           <w:p>
             <w:r>
@@ -3625,7 +3630,7 @@
         </w:tc>
         <w:tc>
           <w:tcPr>
-            <w:tcW w:type="dxa" w:w="2520"/>
+            <w:tcW w:w="2520" w:type="dxa"/>
           </w:tcPr>
           <w:p>
             <w:r>
@@ -3637,7 +3642,7 @@
       <w:tr>
         <w:tc>
           <w:tcPr>
-            <w:tcW w:type="dxa" w:w="2520"/>
+            <w:tcW w:w="2520" w:type="dxa"/>
           </w:tcPr>
           <w:p>
             <w:r>
@@ -3647,7 +3652,7 @@
         </w:tc>
         <w:tc>
           <w:tcPr>
-            <w:tcW w:type="dxa" w:w="2520"/>
+            <w:tcW w:w="2520" w:type="dxa"/>
           </w:tcPr>
           <w:p>
             <w:r>
@@ -3657,7 +3662,7 @@
         </w:tc>
         <w:tc>
           <w:tcPr>
-            <w:tcW w:type="dxa" w:w="2520"/>
+            <w:tcW w:w="2520" w:type="dxa"/>
           </w:tcPr>
           <w:p>
             <w:r>
@@ -3667,7 +3672,7 @@
         </w:tc>
         <w:tc>
           <w:tcPr>
-            <w:tcW w:type="dxa" w:w="2520"/>
+            <w:tcW w:w="2520" w:type="dxa"/>
           </w:tcPr>
           <w:p>
             <w:r>
@@ -3679,7 +3684,7 @@
       <w:tr>
         <w:tc>
           <w:tcPr>
-            <w:tcW w:type="dxa" w:w="2520"/>
+            <w:tcW w:w="2520" w:type="dxa"/>
           </w:tcPr>
           <w:p>
             <w:r>
@@ -3689,7 +3694,7 @@
         </w:tc>
         <w:tc>
           <w:tcPr>
-            <w:tcW w:type="dxa" w:w="2520"/>
+            <w:tcW w:w="2520" w:type="dxa"/>
           </w:tcPr>
           <w:p>
             <w:r>
@@ -3699,7 +3704,7 @@
         </w:tc>
         <w:tc>
           <w:tcPr>
-            <w:tcW w:type="dxa" w:w="2520"/>
+            <w:tcW w:w="2520" w:type="dxa"/>
           </w:tcPr>
           <w:p>
             <w:r>
@@ -3709,7 +3714,7 @@
         </w:tc>
         <w:tc>
           <w:tcPr>
-            <w:tcW w:type="dxa" w:w="2520"/>
+            <w:tcW w:w="2520" w:type="dxa"/>
           </w:tcPr>
           <w:p>
             <w:r>
@@ -3721,7 +3726,7 @@
       <w:tr>
         <w:tc>
           <w:tcPr>
-            <w:tcW w:type="dxa" w:w="2520"/>
+            <w:tcW w:w="2520" w:type="dxa"/>
           </w:tcPr>
           <w:p>
             <w:r>
@@ -3731,7 +3736,7 @@
         </w:tc>
         <w:tc>
           <w:tcPr>
-            <w:tcW w:type="dxa" w:w="2520"/>
+            <w:tcW w:w="2520" w:type="dxa"/>
           </w:tcPr>
           <w:p>
             <w:r>
@@ -3741,7 +3746,7 @@
         </w:tc>
         <w:tc>
           <w:tcPr>
-            <w:tcW w:type="dxa" w:w="2520"/>
+            <w:tcW w:w="2520" w:type="dxa"/>
           </w:tcPr>
           <w:p>
             <w:r>
@@ -3751,7 +3756,7 @@
         </w:tc>
         <w:tc>
           <w:tcPr>
-            <w:tcW w:type="dxa" w:w="2520"/>
+            <w:tcW w:w="2520" w:type="dxa"/>
           </w:tcPr>
           <w:p>
             <w:r>
@@ -3763,7 +3768,7 @@
       <w:tr>
         <w:tc>
           <w:tcPr>
-            <w:tcW w:type="dxa" w:w="2520"/>
+            <w:tcW w:w="2520" w:type="dxa"/>
           </w:tcPr>
           <w:p>
             <w:r>
@@ -3773,7 +3778,7 @@
         </w:tc>
         <w:tc>
           <w:tcPr>
-            <w:tcW w:type="dxa" w:w="2520"/>
+            <w:tcW w:w="2520" w:type="dxa"/>
           </w:tcPr>
           <w:p>
             <w:r>
@@ -3783,7 +3788,7 @@
         </w:tc>
         <w:tc>
           <w:tcPr>
-            <w:tcW w:type="dxa" w:w="2520"/>
+            <w:tcW w:w="2520" w:type="dxa"/>
           </w:tcPr>
           <w:p>
             <w:r>
@@ -3793,7 +3798,7 @@
         </w:tc>
         <w:tc>
           <w:tcPr>
-            <w:tcW w:type="dxa" w:w="2520"/>
+            <w:tcW w:w="2520" w:type="dxa"/>
           </w:tcPr>
           <w:p>
             <w:r>
@@ -3816,8 +3821,8 @@
     <w:tbl>
       <w:tblPr>
         <w:tblStyle w:val="TableGrid"/>
-        <w:tblW w:type="auto" w:w="0"/>
-        <w:tblLook w:firstColumn="1" w:firstRow="1" w:lastColumn="0" w:lastRow="0" w:noHBand="0" w:noVBand="1" w:val="04A0"/>
+        <w:tblW w:w="0" w:type="auto"/>
+        <w:tblLook w:val="04A0" w:firstRow="1" w:lastRow="0" w:firstColumn="1" w:lastColumn="0" w:noHBand="0" w:noVBand="1"/>
       </w:tblPr>
       <w:tblGrid>
         <w:gridCol w:w="1680"/>
@@ -3830,7 +3835,7 @@
       <w:tr>
         <w:tc>
           <w:tcPr>
-            <w:tcW w:type="dxa" w:w="1680"/>
+            <w:tcW w:w="1680" w:type="dxa"/>
           </w:tcPr>
           <w:p>
             <w:r>
@@ -3840,7 +3845,7 @@
         </w:tc>
         <w:tc>
           <w:tcPr>
-            <w:tcW w:type="dxa" w:w="1680"/>
+            <w:tcW w:w="1680" w:type="dxa"/>
           </w:tcPr>
           <w:p>
             <w:r>
@@ -3850,7 +3855,7 @@
         </w:tc>
         <w:tc>
           <w:tcPr>
-            <w:tcW w:type="dxa" w:w="1680"/>
+            <w:tcW w:w="1680" w:type="dxa"/>
           </w:tcPr>
           <w:p>
             <w:r>
@@ -3860,7 +3865,7 @@
         </w:tc>
         <w:tc>
           <w:tcPr>
-            <w:tcW w:type="dxa" w:w="1680"/>
+            <w:tcW w:w="1680" w:type="dxa"/>
           </w:tcPr>
           <w:p>
             <w:r>
@@ -3870,7 +3875,7 @@
         </w:tc>
         <w:tc>
           <w:tcPr>
-            <w:tcW w:type="dxa" w:w="1680"/>
+            <w:tcW w:w="1680" w:type="dxa"/>
           </w:tcPr>
           <w:p>
             <w:r>
@@ -3880,7 +3885,7 @@
         </w:tc>
         <w:tc>
           <w:tcPr>
-            <w:tcW w:type="dxa" w:w="1680"/>
+            <w:tcW w:w="1680" w:type="dxa"/>
           </w:tcPr>
           <w:p>
             <w:r>
@@ -3892,7 +3897,7 @@
       <w:tr>
         <w:tc>
           <w:tcPr>
-            <w:tcW w:type="dxa" w:w="1680"/>
+            <w:tcW w:w="1680" w:type="dxa"/>
           </w:tcPr>
           <w:p>
             <w:r>
@@ -3902,7 +3907,7 @@
         </w:tc>
         <w:tc>
           <w:tcPr>
-            <w:tcW w:type="dxa" w:w="1680"/>
+            <w:tcW w:w="1680" w:type="dxa"/>
           </w:tcPr>
           <w:p>
             <w:r>
@@ -3912,7 +3917,7 @@
         </w:tc>
         <w:tc>
           <w:tcPr>
-            <w:tcW w:type="dxa" w:w="1680"/>
+            <w:tcW w:w="1680" w:type="dxa"/>
           </w:tcPr>
           <w:p>
             <w:r>
@@ -3922,7 +3927,7 @@
         </w:tc>
         <w:tc>
           <w:tcPr>
-            <w:tcW w:type="dxa" w:w="1680"/>
+            <w:tcW w:w="1680" w:type="dxa"/>
           </w:tcPr>
           <w:p>
             <w:r>
@@ -3932,7 +3937,7 @@
         </w:tc>
         <w:tc>
           <w:tcPr>
-            <w:tcW w:type="dxa" w:w="1680"/>
+            <w:tcW w:w="1680" w:type="dxa"/>
           </w:tcPr>
           <w:p>
             <w:r>
@@ -3942,7 +3947,7 @@
         </w:tc>
         <w:tc>
           <w:tcPr>
-            <w:tcW w:type="dxa" w:w="1680"/>
+            <w:tcW w:w="1680" w:type="dxa"/>
           </w:tcPr>
           <w:p>
             <w:r>
@@ -3954,7 +3959,7 @@
       <w:tr>
         <w:tc>
           <w:tcPr>
-            <w:tcW w:type="dxa" w:w="1680"/>
+            <w:tcW w:w="1680" w:type="dxa"/>
           </w:tcPr>
           <w:p>
             <w:r>
@@ -3964,7 +3969,7 @@
         </w:tc>
         <w:tc>
           <w:tcPr>
-            <w:tcW w:type="dxa" w:w="1680"/>
+            <w:tcW w:w="1680" w:type="dxa"/>
           </w:tcPr>
           <w:p>
             <w:r>
@@ -3974,7 +3979,7 @@
         </w:tc>
         <w:tc>
           <w:tcPr>
-            <w:tcW w:type="dxa" w:w="1680"/>
+            <w:tcW w:w="1680" w:type="dxa"/>
           </w:tcPr>
           <w:p>
             <w:r>
@@ -3984,7 +3989,7 @@
         </w:tc>
         <w:tc>
           <w:tcPr>
-            <w:tcW w:type="dxa" w:w="1680"/>
+            <w:tcW w:w="1680" w:type="dxa"/>
           </w:tcPr>
           <w:p>
             <w:r>
@@ -3994,7 +3999,7 @@
         </w:tc>
         <w:tc>
           <w:tcPr>
-            <w:tcW w:type="dxa" w:w="1680"/>
+            <w:tcW w:w="1680" w:type="dxa"/>
           </w:tcPr>
           <w:p>
             <w:r>
@@ -4004,7 +4009,7 @@
         </w:tc>
         <w:tc>
           <w:tcPr>
-            <w:tcW w:type="dxa" w:w="1680"/>
+            <w:tcW w:w="1680" w:type="dxa"/>
           </w:tcPr>
           <w:p>
             <w:r>
@@ -4016,7 +4021,7 @@
       <w:tr>
         <w:tc>
           <w:tcPr>
-            <w:tcW w:type="dxa" w:w="1680"/>
+            <w:tcW w:w="1680" w:type="dxa"/>
           </w:tcPr>
           <w:p>
             <w:r>
@@ -4026,7 +4031,7 @@
         </w:tc>
         <w:tc>
           <w:tcPr>
-            <w:tcW w:type="dxa" w:w="1680"/>
+            <w:tcW w:w="1680" w:type="dxa"/>
           </w:tcPr>
           <w:p>
             <w:r>
@@ -4036,7 +4041,7 @@
         </w:tc>
         <w:tc>
           <w:tcPr>
-            <w:tcW w:type="dxa" w:w="1680"/>
+            <w:tcW w:w="1680" w:type="dxa"/>
           </w:tcPr>
           <w:p>
             <w:r>
@@ -4046,7 +4051,7 @@
         </w:tc>
         <w:tc>
           <w:tcPr>
-            <w:tcW w:type="dxa" w:w="1680"/>
+            <w:tcW w:w="1680" w:type="dxa"/>
           </w:tcPr>
           <w:p>
             <w:r>
@@ -4056,7 +4061,7 @@
         </w:tc>
         <w:tc>
           <w:tcPr>
-            <w:tcW w:type="dxa" w:w="1680"/>
+            <w:tcW w:w="1680" w:type="dxa"/>
           </w:tcPr>
           <w:p>
             <w:r>
@@ -4066,7 +4071,7 @@
         </w:tc>
         <w:tc>
           <w:tcPr>
-            <w:tcW w:type="dxa" w:w="1680"/>
+            <w:tcW w:w="1680" w:type="dxa"/>
           </w:tcPr>
           <w:p>
             <w:r>
@@ -4078,7 +4083,7 @@
       <w:tr>
         <w:tc>
           <w:tcPr>
-            <w:tcW w:type="dxa" w:w="1680"/>
+            <w:tcW w:w="1680" w:type="dxa"/>
           </w:tcPr>
           <w:p>
             <w:r>
@@ -4088,7 +4093,7 @@
         </w:tc>
         <w:tc>
           <w:tcPr>
-            <w:tcW w:type="dxa" w:w="1680"/>
+            <w:tcW w:w="1680" w:type="dxa"/>
           </w:tcPr>
           <w:p>
             <w:r>
@@ -4098,7 +4103,7 @@
         </w:tc>
         <w:tc>
           <w:tcPr>
-            <w:tcW w:type="dxa" w:w="1680"/>
+            <w:tcW w:w="1680" w:type="dxa"/>
           </w:tcPr>
           <w:p>
             <w:r>
@@ -4108,7 +4113,7 @@
         </w:tc>
         <w:tc>
           <w:tcPr>
-            <w:tcW w:type="dxa" w:w="1680"/>
+            <w:tcW w:w="1680" w:type="dxa"/>
           </w:tcPr>
           <w:p>
             <w:r>
@@ -4118,7 +4123,7 @@
         </w:tc>
         <w:tc>
           <w:tcPr>
-            <w:tcW w:type="dxa" w:w="1680"/>
+            <w:tcW w:w="1680" w:type="dxa"/>
           </w:tcPr>
           <w:p>
             <w:r>
@@ -4128,7 +4133,7 @@
         </w:tc>
         <w:tc>
           <w:tcPr>
-            <w:tcW w:type="dxa" w:w="1680"/>
+            <w:tcW w:w="1680" w:type="dxa"/>
           </w:tcPr>
           <w:p>
             <w:r>
@@ -4140,7 +4145,7 @@
       <w:tr>
         <w:tc>
           <w:tcPr>
-            <w:tcW w:type="dxa" w:w="1680"/>
+            <w:tcW w:w="1680" w:type="dxa"/>
           </w:tcPr>
           <w:p>
             <w:r>
@@ -4150,7 +4155,7 @@
         </w:tc>
         <w:tc>
           <w:tcPr>
-            <w:tcW w:type="dxa" w:w="1680"/>
+            <w:tcW w:w="1680" w:type="dxa"/>
           </w:tcPr>
           <w:p>
             <w:r>
@@ -4160,7 +4165,7 @@
         </w:tc>
         <w:tc>
           <w:tcPr>
-            <w:tcW w:type="dxa" w:w="1680"/>
+            <w:tcW w:w="1680" w:type="dxa"/>
           </w:tcPr>
           <w:p>
             <w:r>
@@ -4170,7 +4175,7 @@
         </w:tc>
         <w:tc>
           <w:tcPr>
-            <w:tcW w:type="dxa" w:w="1680"/>
+            <w:tcW w:w="1680" w:type="dxa"/>
           </w:tcPr>
           <w:p>
             <w:r>
@@ -4180,7 +4185,7 @@
         </w:tc>
         <w:tc>
           <w:tcPr>
-            <w:tcW w:type="dxa" w:w="1680"/>
+            <w:tcW w:w="1680" w:type="dxa"/>
           </w:tcPr>
           <w:p>
             <w:r>
@@ -4190,7 +4195,7 @@
         </w:tc>
         <w:tc>
           <w:tcPr>
-            <w:tcW w:type="dxa" w:w="1680"/>
+            <w:tcW w:w="1680" w:type="dxa"/>
           </w:tcPr>
           <w:p>
             <w:r>
@@ -4268,22 +4273,27 @@
         <w:jc w:val="center"/>
       </w:pPr>
       <w:r>
+        <w:rPr>
+          <w:noProof/>
+        </w:rPr>
+        <w:lastRenderedPageBreak/>
         <w:drawing>
-          <wp:inline xmlns:a="http://schemas.openxmlformats.org/drawingml/2006/main" xmlns:pic="http://schemas.openxmlformats.org/drawingml/2006/picture">
+          <wp:inline distT="0" distB="0" distL="0" distR="0" wp14:anchorId="0CF807E9" wp14:editId="22543D5A">
             <wp:extent cx="5760720" cy="6000750"/>
+            <wp:effectExtent l="0" t="0" r="0" b="0"/>
             <wp:docPr id="4" name="Picture 4"/>
             <wp:cNvGraphicFramePr>
-              <a:graphicFrameLocks noChangeAspect="1"/>
+              <a:graphicFrameLocks xmlns:a="http://schemas.openxmlformats.org/drawingml/2006/main" noChangeAspect="1"/>
             </wp:cNvGraphicFramePr>
-            <a:graphic>
+            <a:graphic xmlns:a="http://schemas.openxmlformats.org/drawingml/2006/main">
               <a:graphicData uri="http://schemas.openxmlformats.org/drawingml/2006/picture">
-                <pic:pic>
+                <pic:pic xmlns:pic="http://schemas.openxmlformats.org/drawingml/2006/picture">
                   <pic:nvPicPr>
                     <pic:cNvPr id="0" name="eos-dashboard-stream-metrics.png"/>
                     <pic:cNvPicPr/>
                   </pic:nvPicPr>
                   <pic:blipFill>
-                    <a:blip r:embed="rId12"/>
+                    <a:blip r:embed="rId8"/>
                     <a:stretch>
                       <a:fillRect/>
                     </a:stretch>
@@ -4293,7 +4303,9 @@
                       <a:off x="0" y="0"/>
                       <a:ext cx="5760720" cy="6000750"/>
                     </a:xfrm>
-                    <a:prstGeom prst="rect"/>
+                    <a:prstGeom prst="rect">
+                      <a:avLst/>
+                    </a:prstGeom>
                   </pic:spPr>
                 </pic:pic>
               </a:graphicData>
@@ -4340,7 +4352,7 @@
                     <pic:cNvPicPr/>
                   </pic:nvPicPr>
                   <pic:blipFill>
-                    <a:blip r:embed="rId8"/>
+                    <a:blip r:embed="rId9"/>
                     <a:stretch>
                       <a:fillRect/>
                     </a:stretch>
@@ -4700,7 +4712,7 @@
       <w:tr>
         <w:tc>
           <w:tcPr>
-            <w:tcW w:type="dxa" w:w="3360"/>
+            <w:tcW w:w="3360" w:type="dxa"/>
           </w:tcPr>
           <w:p>
             <w:r>
@@ -4710,7 +4722,7 @@
         </w:tc>
         <w:tc>
           <w:tcPr>
-            <w:tcW w:type="dxa" w:w="3496"/>
+            <w:tcW w:w="3496" w:type="dxa"/>
           </w:tcPr>
           <w:p>
             <w:r>
@@ -4720,7 +4732,7 @@
         </w:tc>
         <w:tc>
           <w:tcPr>
-            <w:tcW w:type="dxa" w:w="3360"/>
+            <w:tcW w:w="3360" w:type="dxa"/>
           </w:tcPr>
           <w:p>
             <w:r>
@@ -4757,11 +4769,11 @@
         <w:spacing w:after="100" w:line="259" w:lineRule="auto"/>
       </w:pPr>
       <w:r>
-        <w:t xml:space="preserve">Thiết kế hiện tại phù hợp cho demo môn học nhưng còn một số giới hạn. Thứ nhất, global dedup store là coordination point tập trung; nếu production cần high availability thì phải replication hoặc consensus cho dedup table. Thứ hai, account state được seed giống nhau giữa node để đơn giản hóa demo, chưa phải mô hình account sharding/replication đầy đủ. Thứ ba, hệ thống chưa cài đặt distributed commit protocol kiểu 2PC cho transfer chạm nhiều shard account; project tập trung vào EOS/idempotency cho payment request. Thứ tư, benchmark chạy </w:t>
+        <w:t xml:space="preserve">Thiết kế hiện tại phù hợp cho demo môn học nhưng còn một số giới hạn. Thứ nhất, global dedup store là coordination point tập trung; nếu production cần high availability thì phải replication hoặc consensus cho dedup table. Thứ hai, account state được seed giống nhau giữa node để đơn giản hóa demo, chưa phải mô hình account sharding/replication đầy đủ. Thứ ba, hệ thống chưa cài đặt distributed commit protocol kiểu 2PC cho transfer </w:t>
       </w:r>
       <w:r>
         <w:lastRenderedPageBreak/>
-        <w:t>local nên network latency thật chưa được mô phỏng sâu như WAN; có thể mở rộng bằng latency injection hoặc Docker network emulation.</w:t>
+        <w:t>chạm nhiều shard account; project tập trung vào EOS/idempotency cho payment request. Thứ tư, benchmark chạy local nên network latency thật chưa được mô phỏng sâu như WAN; có thể mở rộng bằng latency injection hoặc Docker network emulation.</w:t>
       </w:r>
     </w:p>
     <w:p>

</xml_diff>